<commit_message>
convert HoaBanMaiEdu to HBMEdu
</commit_message>
<xml_diff>
--- a/public/template_BC.docx
+++ b/public/template_BC.docx
@@ -4,44 +4,61 @@
   <w:body>
     <w:p>
       <w:pPr>
-        <w:spacing w:line="360" w:lineRule="auto"/>
+        <w:spacing w:after="0" w:line="360" w:lineRule="auto"/>
         <w:jc w:val="center"/>
         <w:rPr>
           <w:b/>
           <w:color w:val="274E13"/>
-          <w:sz w:val="26"/>
           <w:szCs w:val="26"/>
+          <w:lang w:val="en-US"/>
         </w:rPr>
       </w:pPr>
       <w:r>
         <w:rPr>
           <w:b/>
           <w:color w:val="274E13"/>
-          <w:sz w:val="26"/>
           <w:szCs w:val="26"/>
+          <w:lang w:val="en-US"/>
         </w:rPr>
-        <w:t xml:space="preserve">TRUNG TÂM CAN THIỆP SỚM </w:t>
+        <w:t xml:space="preserve">CÔNG TY TNHH GIÁO DỤC HÒA NHẬP </w:t>
       </w:r>
     </w:p>
     <w:p>
       <w:pPr>
-        <w:spacing w:line="360" w:lineRule="auto"/>
+        <w:spacing w:after="0" w:line="360" w:lineRule="auto"/>
         <w:jc w:val="center"/>
         <w:rPr>
           <w:b/>
           <w:color w:val="274E13"/>
-          <w:sz w:val="26"/>
           <w:szCs w:val="26"/>
+          <w:lang w:val="en-US"/>
         </w:rPr>
       </w:pPr>
       <w:r>
         <w:rPr>
           <w:b/>
           <w:color w:val="274E13"/>
-          <w:sz w:val="26"/>
+          <w:szCs w:val="26"/>
+          <w:lang w:val="en-US"/>
+        </w:rPr>
+        <w:t>VÀ CAN THIỆP SỚM</w:t>
+      </w:r>
+      <w:r>
+        <w:rPr>
+          <w:b/>
+          <w:color w:val="274E13"/>
           <w:szCs w:val="26"/>
         </w:rPr>
-        <w:t>HOA BAN MAI EDU</w:t>
+        <w:t xml:space="preserve"> </w:t>
+      </w:r>
+      <w:r>
+        <w:rPr>
+          <w:b/>
+          <w:color w:val="274E13"/>
+          <w:szCs w:val="26"/>
+          <w:lang w:val="en-US"/>
+        </w:rPr>
+        <w:t>QUẢNG XƯƠNG</w:t>
       </w:r>
     </w:p>
     <w:p>
@@ -59,27 +76,34 @@
         <w:rPr>
           <w:b/>
           <w:noProof/>
-          <w:color w:val="274E13"/>
+          <w:color w:val="0000FF"/>
           <w:sz w:val="26"/>
           <w:szCs w:val="26"/>
           <w:lang w:val="en-US" w:eastAsia="en-US"/>
         </w:rPr>
         <w:drawing>
-          <wp:inline distT="114300" distB="114300" distL="114300" distR="114300">
-            <wp:extent cx="624587" cy="624587"/>
+          <wp:inline distT="0" distB="0" distL="0" distR="0">
+            <wp:extent cx="733425" cy="675826"/>
             <wp:effectExtent l="0" t="0" r="0" b="0"/>
-            <wp:docPr id="1" name="image1.png"/>
-            <wp:cNvGraphicFramePr/>
+            <wp:docPr id="2" name="Picture 2"/>
+            <wp:cNvGraphicFramePr>
+              <a:graphicFrameLocks xmlns:a="http://schemas.openxmlformats.org/drawingml/2006/main" noChangeAspect="1"/>
+            </wp:cNvGraphicFramePr>
             <a:graphic xmlns:a="http://schemas.openxmlformats.org/drawingml/2006/main">
               <a:graphicData uri="http://schemas.openxmlformats.org/drawingml/2006/picture">
                 <pic:pic xmlns:pic="http://schemas.openxmlformats.org/drawingml/2006/picture">
                   <pic:nvPicPr>
-                    <pic:cNvPr id="0" name="image1.png"/>
-                    <pic:cNvPicPr preferRelativeResize="0"/>
+                    <pic:cNvPr id="2" name="QXEdu-icon.png"/>
+                    <pic:cNvPicPr/>
                   </pic:nvPicPr>
                   <pic:blipFill>
-                    <a:blip r:embed="rId6"/>
-                    <a:srcRect/>
+                    <a:blip r:embed="rId6" cstate="print">
+                      <a:extLst>
+                        <a:ext uri="{28A0092B-C50C-407E-A947-70E740481C1C}">
+                          <a14:useLocalDpi xmlns:a14="http://schemas.microsoft.com/office/drawing/2010/main" val="0"/>
+                        </a:ext>
+                      </a:extLst>
+                    </a:blip>
                     <a:stretch>
                       <a:fillRect/>
                     </a:stretch>
@@ -87,12 +111,11 @@
                   <pic:spPr>
                     <a:xfrm>
                       <a:off x="0" y="0"/>
-                      <a:ext cx="624587" cy="624587"/>
+                      <a:ext cx="811777" cy="748025"/>
                     </a:xfrm>
                     <a:prstGeom prst="rect">
                       <a:avLst/>
                     </a:prstGeom>
-                    <a:ln/>
                   </pic:spPr>
                 </pic:pic>
               </a:graphicData>
@@ -222,6 +245,7 @@
                 <w:b/>
                 <w:sz w:val="26"/>
                 <w:szCs w:val="26"/>
+                <w:lang w:val="en-US"/>
               </w:rPr>
             </w:pPr>
             <w:r>
@@ -229,9 +253,12 @@
                 <w:b/>
                 <w:sz w:val="26"/>
                 <w:szCs w:val="26"/>
+                <w:lang w:val="en-US"/>
               </w:rPr>
-              <w:t>Nội Dung</w:t>
+              <w:t>Lĩnh vực</w:t>
             </w:r>
+            <w:bookmarkStart w:id="0" w:name="_GoBack"/>
+            <w:bookmarkEnd w:id="0"/>
           </w:p>
         </w:tc>
         <w:tc>
@@ -491,14 +518,44 @@
     <w:p/>
     <w:p>
       <w:r>
-        <w:t>Quản lý chuyên môn.                                                    Giáo viên can thiệp</w:t>
+        <w:rPr>
+          <w:lang w:val="en-US"/>
+        </w:rPr>
+        <w:t xml:space="preserve">      Giám đốc</w:t>
+      </w:r>
+      <w:r>
+        <w:t xml:space="preserve">                                               </w:t>
+      </w:r>
+      <w:r>
+        <w:rPr>
+          <w:lang w:val="en-US"/>
+        </w:rPr>
+        <w:t xml:space="preserve">  </w:t>
+      </w:r>
+      <w:r>
+        <w:t xml:space="preserve">  </w:t>
+      </w:r>
+      <w:r>
+        <w:rPr>
+          <w:lang w:val="en-US"/>
+        </w:rPr>
+        <w:t xml:space="preserve">   </w:t>
+      </w:r>
+      <w:r>
+        <w:t xml:space="preserve">   Giáo viên can thiệp</w:t>
       </w:r>
     </w:p>
     <w:p/>
     <w:p/>
     <w:p>
       <w:r>
-        <w:t xml:space="preserve">Th.s Trần Thị My Ny.                                                  </w:t>
+        <w:rPr>
+          <w:lang w:val="en-US"/>
+        </w:rPr>
+        <w:t>Mai Thị Phương</w:t>
+      </w:r>
+      <w:r>
+        <w:t xml:space="preserve">                                               </w:t>
       </w:r>
       <w:r>
         <w:rPr>
@@ -506,8 +563,9 @@
         </w:rPr>
         <w:t xml:space="preserve">    </w:t>
       </w:r>
-      <w:bookmarkStart w:id="0" w:name="_GoBack"/>
-      <w:bookmarkEnd w:id="0"/>
+      <w:r>
+        <w:t xml:space="preserve"> </w:t>
+      </w:r>
       <w:r>
         <w:rPr>
           <w:lang w:val="en-US"/>

</xml_diff>

<commit_message>
fix file BC.doc KH.doc
</commit_message>
<xml_diff>
--- a/public/template_BC.docx
+++ b/public/template_BC.docx
@@ -20,7 +20,7 @@
           <w:szCs w:val="26"/>
           <w:lang w:val="en-US"/>
         </w:rPr>
-        <w:t xml:space="preserve">CÔNG TY TNHH GIÁO DỤC HÒA NHẬP </w:t>
+        <w:t xml:space="preserve">TRUNG TÂM CAN THIỆP SỚM </w:t>
       </w:r>
     </w:p>
     <w:p>
@@ -41,24 +41,7 @@
           <w:szCs w:val="26"/>
           <w:lang w:val="en-US"/>
         </w:rPr>
-        <w:t>VÀ CAN THIỆP SỚM</w:t>
-      </w:r>
-      <w:r>
-        <w:rPr>
-          <w:b/>
-          <w:color w:val="274E13"/>
-          <w:szCs w:val="26"/>
-        </w:rPr>
-        <w:t xml:space="preserve"> </w:t>
-      </w:r>
-      <w:r>
-        <w:rPr>
-          <w:b/>
-          <w:color w:val="274E13"/>
-          <w:szCs w:val="26"/>
-          <w:lang w:val="en-US"/>
-        </w:rPr>
-        <w:t>QUẢNG XƯƠNG</w:t>
+        <w:t>HOA BAN MAI EDU</w:t>
       </w:r>
     </w:p>
     <w:p>
@@ -83,9 +66,9 @@
         </w:rPr>
         <w:drawing>
           <wp:inline distT="0" distB="0" distL="0" distR="0">
-            <wp:extent cx="733425" cy="675826"/>
+            <wp:extent cx="764274" cy="764274"/>
             <wp:effectExtent l="0" t="0" r="0" b="0"/>
-            <wp:docPr id="2" name="Picture 2"/>
+            <wp:docPr id="1" name="Picture 1"/>
             <wp:cNvGraphicFramePr>
               <a:graphicFrameLocks xmlns:a="http://schemas.openxmlformats.org/drawingml/2006/main" noChangeAspect="1"/>
             </wp:cNvGraphicFramePr>
@@ -93,7 +76,7 @@
               <a:graphicData uri="http://schemas.openxmlformats.org/drawingml/2006/picture">
                 <pic:pic xmlns:pic="http://schemas.openxmlformats.org/drawingml/2006/picture">
                   <pic:nvPicPr>
-                    <pic:cNvPr id="2" name="QXEdu-icon.png"/>
+                    <pic:cNvPr id="1" name="HBMEdu-icon-512x512.png"/>
                     <pic:cNvPicPr/>
                   </pic:nvPicPr>
                   <pic:blipFill>
@@ -111,7 +94,7 @@
                   <pic:spPr>
                     <a:xfrm>
                       <a:off x="0" y="0"/>
-                      <a:ext cx="811777" cy="748025"/>
+                      <a:ext cx="799461" cy="799461"/>
                     </a:xfrm>
                     <a:prstGeom prst="rect">
                       <a:avLst/>
@@ -257,8 +240,6 @@
               </w:rPr>
               <w:t>Lĩnh vực</w:t>
             </w:r>
-            <w:bookmarkStart w:id="0" w:name="_GoBack"/>
-            <w:bookmarkEnd w:id="0"/>
           </w:p>
         </w:tc>
         <w:tc>
@@ -545,26 +526,34 @@
         <w:t xml:space="preserve">   Giáo viên can thiệp</w:t>
       </w:r>
     </w:p>
-    <w:p/>
-    <w:p/>
     <w:p>
+      <w:pPr>
+        <w:rPr>
+          <w:lang w:val="en-US"/>
+        </w:rPr>
+      </w:pPr>
+      <w:bookmarkStart w:id="0" w:name="_GoBack"/>
+      <w:bookmarkEnd w:id="0"/>
+    </w:p>
+    <w:p>
+      <w:pPr>
+        <w:rPr>
+          <w:lang w:val="en-US"/>
+        </w:rPr>
+      </w:pPr>
+    </w:p>
+    <w:p>
+      <w:pPr>
+        <w:ind w:left="-180"/>
+      </w:pPr>
       <w:r>
         <w:rPr>
           <w:lang w:val="en-US"/>
         </w:rPr>
-        <w:t>Mai Thị Phương</w:t>
+        <w:t>Ths. Trần Thị My Ny</w:t>
       </w:r>
       <w:r>
         <w:t xml:space="preserve">                                               </w:t>
-      </w:r>
-      <w:r>
-        <w:rPr>
-          <w:lang w:val="en-US"/>
-        </w:rPr>
-        <w:t xml:space="preserve">    </w:t>
-      </w:r>
-      <w:r>
-        <w:t xml:space="preserve"> </w:t>
       </w:r>
       <w:r>
         <w:rPr>

</xml_diff>